<commit_message>
docs: perbarui dokumentasi md dan docx sesuai status sistem terkini
- Perbarui spesifikasi 7 tabel database relasional (tambah lpk_members dan user_account_links, hapus backups)
- Sinkronkan modul Kolaborasi Tim Multi-Akun PIC (/account-links) dan peran Lead PIC vs Viewer PIC
- Sinkronkan implementasi Sistem Mode Gelap Instan (1-klik toggle, zero-reload, anti-flicker)
- Dokumentasikan Spanduk Peringatan Pengawasan Wajib (Persistent Surveillance Banner)
- Perbarui metrik pengujian otomatis menjadi 183 kasus uji lulus (1.102 asersi, 100% pass)
- Perbarui 3 berkas DOCX dengan tipografi hitam murni (#000000) dan tanpa em-dash/en-dash
</commit_message>
<xml_diff>
--- a/docs/references/CHEAT_SHEET_PRESENTASI_SIMASADI.docx
+++ b/docs/references/CHEAT_SHEET_PRESENTASI_SIMASADI.docx
@@ -229,7 +229,7 @@
                 <w:color w:val="334155"/>
                 <w:sz w:val="17"/>
               </w:rPr>
-              <w:t>Siap Operasional (Scheduler Terpasang Harian 07:00, 87/87 Tests Passed)</w:t>
+              <w:t>Siap Operasional (Scheduler Terpasang Harian 07:00, 183/183 Tests Passed, 1.102 Asersi)</w:t>
             </w:r>
           </w:p>
         </w:tc>
@@ -1683,6 +1683,28 @@
     </w:p>
     <w:p>
       <w:pPr>
+        <w:spacing w:line="276" w:lineRule="auto" w:after="80"/>
+      </w:pPr>
+      <w:r>
+        <w:rPr>
+          <w:rFonts w:ascii="Calibri" w:hAnsi="Calibri"/>
+          <w:b/>
+          <w:color w:val="0F172A"/>
+          <w:sz w:val="20"/>
+        </w:rPr>
+        <w:t xml:space="preserve">Langkah 5 (Layar Kolaborasi Akun &amp; Mode Gelap): </w:t>
+      </w:r>
+      <w:r>
+        <w:rPr>
+          <w:rFonts w:ascii="Calibri" w:hAnsi="Calibri"/>
+          <w:color w:val="334155"/>
+          <w:sz w:val="20"/>
+        </w:rPr>
+        <w:t>Buka /account-links untuk mendemonstrasikan penautan akun PIC pendamping (Lead PIC vs Viewer PIC), lalu peragakan tombol Mode Gelap di bilah navigasi atas yang beralih tema secara instan tanpa reload.</w:t>
+      </w:r>
+    </w:p>
+    <w:p>
+      <w:pPr>
         <w:keepNext/>
         <w:spacing w:before="280" w:after="80"/>
       </w:pPr>

</xml_diff>